<commit_message>
Add mock login screen + fix web white-screen
- New Login screen (app/login.tsx): email/password + Continue with Google
  / LINE. Mock only — any input proceeds; no real auth yet. Flow is now
  Splash -> Login -> Onboarding/Home.
- Fix Vercel white screen: zustand's middleware bundle contains
  'import.meta.env', which Metro left untransformed and crashed the web
  bundle. Replaced the persist middleware in the settings store with
  direct AsyncStorage persistence — no zustand/middleware import.
- IMPROVEMENTS.md: noted auth is an open backend decision.
- Integration handoff doc updated with the login/auth status.

Co-Authored-By: Claude Opus 4.7 (1M context) <noreply@anthropic.com>
</commit_message>
<xml_diff>
--- a/ShuttleCoach_Integration_Handoff.docx
+++ b/ShuttleCoach_Integration_Handoff.docx
@@ -1698,6 +1698,20 @@
         <w:rPr>
           <w:b/>
         </w:rPr>
+        <w:t>Login / auth (NOT built):</w:t>
+      </w:r>
+      <w:r>
+        <w:t xml:space="preserve"> app/login.tsx is a MOCK login screen — email/password fields plus 'Continue with Google' and 'Continue with LINE'. Any input or button just proceeds; there is NO real authentication, password storage or OAuth yet. Real auth is yours to build: add the endpoints, issue a session token, and wire the screen's proceed() to a real sign-in call. The 'Sign up' link is also a placeholder. The app flow is Splash -&gt; Login -&gt; Onboarding/Home.</w:t>
+      </w:r>
+    </w:p>
+    <w:p>
+      <w:pPr>
+        <w:pStyle w:val="ListBullet"/>
+      </w:pPr>
+      <w:r>
+        <w:rPr>
+          <w:b/>
+        </w:rPr>
         <w:t>Sample videos:</w:t>
       </w:r>
       <w:r>

</xml_diff>